<commit_message>
Grafika h7 a h8 podle D. Tyla: test peti sekund, Excel, pravidlo pro AI
Hodina 7: test peti sekund na ukazce B, tri principy (hierarchie,
blizkost a kontrast, poctivy graf) nejdriv otazkou, jedna sada dat
a jeden graf v Excelu (Office 365), Canva volitelne, test u spoluzaka
s pevnymi vetami a oprava. Hodina 8: Urceno pro, vlastni tema uvnitr
variant, pravidlo pro AI, test peti sekund, obhajoby sjednocene
s planem, mereni na ukazce B. Rubrika: kriterium Srozumitelnost.
Hodiny 4 a 5: veta pro koho. Zacni zde: co se zmenilo, popis v bance.

Co-Authored-By: Claude Opus 5.5 <noreply@anthropic.com>
</commit_message>
<xml_diff>
--- a/public/materialy/1L/6/Pro učitele/Hodnocení, testy a řešení.docx
+++ b/public/materialy/1L/6/Pro učitele/Hodnocení, testy a řešení.docx
@@ -411,7 +411,7 @@
               <w:rPr>
                 <w:sz w:val="19"/>
               </w:rPr>
-              <w:t>Zdroj, vzorek i omezení uvedeny.</w:t>
+              <w:t xml:space="preserve">Zdroj, vzorek i omezení uvedeny; původ obrázků i použití AI přiznané.</w:t>
             </w:r>
           </w:p>
         </w:tc>
@@ -443,7 +443,73 @@
               <w:rPr>
                 <w:sz w:val="19"/>
               </w:rPr>
-              <w:t>Data zavádějí.</w:t>
+              <w:t xml:space="preserve">Data zavádějí, nebo je zamlčený původ obrázků či AI.</w:t>
+            </w:r>
+          </w:p>
+        </w:tc>
+      </w:tr>
+      <w:tr>
+        <w:tc>
+          <w:tcPr>
+            <w:tcW w:type="dxa" w:w="2494"/>
+          </w:tcPr>
+          <w:p>
+            <w:pPr>
+              <w:spacing w:after="40" w:before="40"/>
+            </w:pPr>
+            <w:r>
+              <w:rPr>
+                <w:sz w:val="19"/>
+              </w:rPr>
+              <w:t>Srozumitelnost</w:t>
+            </w:r>
+          </w:p>
+        </w:tc>
+        <w:tc>
+          <w:tcPr>
+            <w:tcW w:type="dxa" w:w="2494"/>
+          </w:tcPr>
+          <w:p>
+            <w:pPr>
+              <w:spacing w:after="40" w:before="40"/>
+            </w:pPr>
+            <w:r>
+              <w:rPr>
+                <w:sz w:val="19"/>
+              </w:rPr>
+              <w:t xml:space="preserve">Hlavní sdělení je poznat do 5 s a odpovídá větě „Čtenář má pochopit“; test a oprava jsou zapsané.</w:t>
+            </w:r>
+          </w:p>
+        </w:tc>
+        <w:tc>
+          <w:tcPr>
+            <w:tcW w:type="dxa" w:w="2494"/>
+          </w:tcPr>
+          <w:p>
+            <w:pPr>
+              <w:spacing w:after="40" w:before="40"/>
+            </w:pPr>
+            <w:r>
+              <w:rPr>
+                <w:sz w:val="19"/>
+              </w:rPr>
+              <w:t>Hlavní sdělení je poznat, ale soupeří s jinými prvky, nebo chybí zápis testu.</w:t>
+            </w:r>
+          </w:p>
+        </w:tc>
+        <w:tc>
+          <w:tcPr>
+            <w:tcW w:type="dxa" w:w="2494"/>
+          </w:tcPr>
+          <w:p>
+            <w:pPr>
+              <w:spacing w:after="40" w:before="40"/>
+            </w:pPr>
+            <w:r>
+              <w:rPr>
+                <w:sz w:val="19"/>
+              </w:rPr>
+              <w:t xml:space="preserve">Hlavní sdělení poznat není.</w:t>
             </w:r>
           </w:p>
         </w:tc>

</xml_diff>